<commit_message>
complete quiz 1 advance
</commit_message>
<xml_diff>
--- a/week1/AI.docx
+++ b/week1/AI.docx
@@ -5,16 +5,24 @@
     <w:p>
       <w:pPr>
         <w:jc w:val="center"/>
+        <w:rPr>
+          <w:b/>
+          <w:bCs/>
+        </w:rPr>
       </w:pPr>
       <w:r>
         <w:rPr>
           <w:rFonts w:hint="eastAsia"/>
+          <w:b/>
+          <w:bCs/>
         </w:rPr>
         <w:t xml:space="preserve">QUIZ 1 </w:t>
       </w:r>
       <w:r>
         <w:rPr>
           <w:rFonts w:hint="eastAsia"/>
+          <w:b/>
+          <w:bCs/>
         </w:rPr>
         <w:t>基礎</w:t>
       </w:r>
@@ -25,9 +33,9 @@
       </w:pPr>
       <w:r>
         <w:drawing>
-          <wp:inline distT="0" distB="0" distL="0" distR="0" wp14:anchorId="07BE3C63" wp14:editId="72684A45">
-            <wp:extent cx="5274171" cy="3271157"/>
-            <wp:effectExtent l="0" t="0" r="3175" b="5715"/>
+          <wp:inline distT="0" distB="0" distL="0" distR="0" wp14:anchorId="07BE3C63" wp14:editId="5CC4C417">
+            <wp:extent cx="4320000" cy="2679359"/>
+            <wp:effectExtent l="0" t="0" r="4445" b="6985"/>
             <wp:docPr id="1" name="圖片 1"/>
             <wp:cNvGraphicFramePr>
               <a:graphicFrameLocks xmlns:a="http://schemas.openxmlformats.org/drawingml/2006/main" noChangeAspect="1"/>
@@ -47,7 +55,7 @@
                   <pic:spPr bwMode="auto">
                     <a:xfrm>
                       <a:off x="0" y="0"/>
-                      <a:ext cx="5274310" cy="3271243"/>
+                      <a:ext cx="4320000" cy="2679359"/>
                     </a:xfrm>
                     <a:prstGeom prst="rect">
                       <a:avLst/>
@@ -71,15 +79,12 @@
     <w:p>
       <w:pPr>
         <w:jc w:val="center"/>
-        <w:rPr>
-          <w:rFonts w:hint="eastAsia"/>
-        </w:rPr>
       </w:pPr>
       <w:r>
         <w:drawing>
-          <wp:inline distT="0" distB="0" distL="0" distR="0" wp14:anchorId="61CC84C4" wp14:editId="4E9FFFFC">
-            <wp:extent cx="5274310" cy="2821305"/>
-            <wp:effectExtent l="0" t="0" r="2540" b="0"/>
+          <wp:inline distT="0" distB="0" distL="0" distR="0" wp14:anchorId="61CC84C4" wp14:editId="4D2C93AD">
+            <wp:extent cx="4320000" cy="2310831"/>
+            <wp:effectExtent l="0" t="0" r="4445" b="0"/>
             <wp:docPr id="2" name="圖片 2"/>
             <wp:cNvGraphicFramePr>
               <a:graphicFrameLocks xmlns:a="http://schemas.openxmlformats.org/drawingml/2006/main" noChangeAspect="1"/>
@@ -100,11 +105,293 @@
                   <pic:spPr>
                     <a:xfrm>
                       <a:off x="0" y="0"/>
-                      <a:ext cx="5274310" cy="2821305"/>
+                      <a:ext cx="4320000" cy="2310831"/>
                     </a:xfrm>
                     <a:prstGeom prst="rect">
                       <a:avLst/>
                     </a:prstGeom>
+                  </pic:spPr>
+                </pic:pic>
+              </a:graphicData>
+            </a:graphic>
+          </wp:inline>
+        </w:drawing>
+      </w:r>
+    </w:p>
+    <w:p>
+      <w:pPr>
+        <w:jc w:val="center"/>
+      </w:pPr>
+      <w:r>
+        <w:drawing>
+          <wp:inline distT="0" distB="0" distL="0" distR="0" wp14:anchorId="5FE6733A" wp14:editId="1E4A52C0">
+            <wp:extent cx="4320000" cy="2278137"/>
+            <wp:effectExtent l="0" t="0" r="4445" b="8255"/>
+            <wp:docPr id="3" name="圖片 3"/>
+            <wp:cNvGraphicFramePr>
+              <a:graphicFrameLocks xmlns:a="http://schemas.openxmlformats.org/drawingml/2006/main" noChangeAspect="1"/>
+            </wp:cNvGraphicFramePr>
+            <a:graphic xmlns:a="http://schemas.openxmlformats.org/drawingml/2006/main">
+              <a:graphicData uri="http://schemas.openxmlformats.org/drawingml/2006/picture">
+                <pic:pic xmlns:pic="http://schemas.openxmlformats.org/drawingml/2006/picture">
+                  <pic:nvPicPr>
+                    <pic:cNvPr id="1" name=""/>
+                    <pic:cNvPicPr/>
+                  </pic:nvPicPr>
+                  <pic:blipFill rotWithShape="1">
+                    <a:blip r:embed="rId6"/>
+                    <a:srcRect t="3531" b="1496"/>
+                    <a:stretch/>
+                  </pic:blipFill>
+                  <pic:spPr bwMode="auto">
+                    <a:xfrm>
+                      <a:off x="0" y="0"/>
+                      <a:ext cx="4320000" cy="2278137"/>
+                    </a:xfrm>
+                    <a:prstGeom prst="rect">
+                      <a:avLst/>
+                    </a:prstGeom>
+                    <a:ln>
+                      <a:noFill/>
+                    </a:ln>
+                    <a:extLst>
+                      <a:ext uri="{53640926-AAD7-44D8-BBD7-CCE9431645EC}">
+                        <a14:shadowObscured xmlns:a14="http://schemas.microsoft.com/office/drawing/2010/main"/>
+                      </a:ext>
+                    </a:extLst>
+                  </pic:spPr>
+                </pic:pic>
+              </a:graphicData>
+            </a:graphic>
+          </wp:inline>
+        </w:drawing>
+      </w:r>
+    </w:p>
+    <w:p>
+      <w:pPr>
+        <w:widowControl/>
+        <w:rPr>
+          <w:b/>
+          <w:bCs/>
+        </w:rPr>
+      </w:pPr>
+      <w:r>
+        <w:rPr>
+          <w:b/>
+          <w:bCs/>
+        </w:rPr>
+        <w:br w:type="page"/>
+      </w:r>
+    </w:p>
+    <w:p>
+      <w:pPr>
+        <w:jc w:val="center"/>
+        <w:rPr>
+          <w:b/>
+          <w:bCs/>
+        </w:rPr>
+      </w:pPr>
+      <w:r>
+        <w:rPr>
+          <w:rFonts w:hint="eastAsia"/>
+          <w:b/>
+          <w:bCs/>
+        </w:rPr>
+        <w:lastRenderedPageBreak/>
+        <w:t>Q</w:t>
+      </w:r>
+      <w:r>
+        <w:rPr>
+          <w:b/>
+          <w:bCs/>
+        </w:rPr>
+        <w:t xml:space="preserve">UIZ 1 </w:t>
+      </w:r>
+      <w:r>
+        <w:rPr>
+          <w:rFonts w:hint="eastAsia"/>
+          <w:b/>
+          <w:bCs/>
+        </w:rPr>
+        <w:t>進階</w:t>
+      </w:r>
+    </w:p>
+    <w:p>
+      <w:pPr>
+        <w:jc w:val="center"/>
+        <w:rPr>
+          <w:rFonts w:hint="eastAsia"/>
+        </w:rPr>
+      </w:pPr>
+      <w:r>
+        <w:drawing>
+          <wp:inline distT="0" distB="0" distL="0" distR="0" wp14:anchorId="61F16090" wp14:editId="0FEE907E">
+            <wp:extent cx="4318964" cy="2277201"/>
+            <wp:effectExtent l="0" t="0" r="5715" b="8890"/>
+            <wp:docPr id="4" name="圖片 4"/>
+            <wp:cNvGraphicFramePr>
+              <a:graphicFrameLocks xmlns:a="http://schemas.openxmlformats.org/drawingml/2006/main" noChangeAspect="1"/>
+            </wp:cNvGraphicFramePr>
+            <a:graphic xmlns:a="http://schemas.openxmlformats.org/drawingml/2006/main">
+              <a:graphicData uri="http://schemas.openxmlformats.org/drawingml/2006/picture">
+                <pic:pic xmlns:pic="http://schemas.openxmlformats.org/drawingml/2006/picture">
+                  <pic:nvPicPr>
+                    <pic:cNvPr id="1" name=""/>
+                    <pic:cNvPicPr/>
+                  </pic:nvPicPr>
+                  <pic:blipFill rotWithShape="1">
+                    <a:blip r:embed="rId7"/>
+                    <a:srcRect t="2788"/>
+                    <a:stretch/>
+                  </pic:blipFill>
+                  <pic:spPr bwMode="auto">
+                    <a:xfrm>
+                      <a:off x="0" y="0"/>
+                      <a:ext cx="4320000" cy="2277747"/>
+                    </a:xfrm>
+                    <a:prstGeom prst="rect">
+                      <a:avLst/>
+                    </a:prstGeom>
+                    <a:ln>
+                      <a:noFill/>
+                    </a:ln>
+                    <a:extLst>
+                      <a:ext uri="{53640926-AAD7-44D8-BBD7-CCE9431645EC}">
+                        <a14:shadowObscured xmlns:a14="http://schemas.microsoft.com/office/drawing/2010/main"/>
+                      </a:ext>
+                    </a:extLst>
+                  </pic:spPr>
+                </pic:pic>
+              </a:graphicData>
+            </a:graphic>
+          </wp:inline>
+        </w:drawing>
+      </w:r>
+      <w:r>
+        <w:drawing>
+          <wp:inline distT="0" distB="0" distL="0" distR="0" wp14:anchorId="5A79F052" wp14:editId="430793BF">
+            <wp:extent cx="4318308" cy="1483360"/>
+            <wp:effectExtent l="0" t="0" r="6350" b="2540"/>
+            <wp:docPr id="5" name="圖片 5"/>
+            <wp:cNvGraphicFramePr>
+              <a:graphicFrameLocks xmlns:a="http://schemas.openxmlformats.org/drawingml/2006/main" noChangeAspect="1"/>
+            </wp:cNvGraphicFramePr>
+            <a:graphic xmlns:a="http://schemas.openxmlformats.org/drawingml/2006/main">
+              <a:graphicData uri="http://schemas.openxmlformats.org/drawingml/2006/picture">
+                <pic:pic xmlns:pic="http://schemas.openxmlformats.org/drawingml/2006/picture">
+                  <pic:nvPicPr>
+                    <pic:cNvPr id="1" name=""/>
+                    <pic:cNvPicPr/>
+                  </pic:nvPicPr>
+                  <pic:blipFill rotWithShape="1">
+                    <a:blip r:embed="rId8"/>
+                    <a:srcRect t="7154"/>
+                    <a:stretch/>
+                  </pic:blipFill>
+                  <pic:spPr bwMode="auto">
+                    <a:xfrm>
+                      <a:off x="0" y="0"/>
+                      <a:ext cx="4320000" cy="1483941"/>
+                    </a:xfrm>
+                    <a:prstGeom prst="rect">
+                      <a:avLst/>
+                    </a:prstGeom>
+                    <a:ln>
+                      <a:noFill/>
+                    </a:ln>
+                    <a:extLst>
+                      <a:ext uri="{53640926-AAD7-44D8-BBD7-CCE9431645EC}">
+                        <a14:shadowObscured xmlns:a14="http://schemas.microsoft.com/office/drawing/2010/main"/>
+                      </a:ext>
+                    </a:extLst>
+                  </pic:spPr>
+                </pic:pic>
+              </a:graphicData>
+            </a:graphic>
+          </wp:inline>
+        </w:drawing>
+      </w:r>
+      <w:r>
+        <w:drawing>
+          <wp:inline distT="0" distB="0" distL="0" distR="0" wp14:anchorId="00B9C927" wp14:editId="25ED9F17">
+            <wp:extent cx="4319458" cy="2265680"/>
+            <wp:effectExtent l="0" t="0" r="5080" b="1270"/>
+            <wp:docPr id="6" name="圖片 6"/>
+            <wp:cNvGraphicFramePr>
+              <a:graphicFrameLocks xmlns:a="http://schemas.openxmlformats.org/drawingml/2006/main" noChangeAspect="1"/>
+            </wp:cNvGraphicFramePr>
+            <a:graphic xmlns:a="http://schemas.openxmlformats.org/drawingml/2006/main">
+              <a:graphicData uri="http://schemas.openxmlformats.org/drawingml/2006/picture">
+                <pic:pic xmlns:pic="http://schemas.openxmlformats.org/drawingml/2006/picture">
+                  <pic:nvPicPr>
+                    <pic:cNvPr id="1" name=""/>
+                    <pic:cNvPicPr/>
+                  </pic:nvPicPr>
+                  <pic:blipFill rotWithShape="1">
+                    <a:blip r:embed="rId9"/>
+                    <a:srcRect t="1654"/>
+                    <a:stretch/>
+                  </pic:blipFill>
+                  <pic:spPr bwMode="auto">
+                    <a:xfrm>
+                      <a:off x="0" y="0"/>
+                      <a:ext cx="4320000" cy="2265964"/>
+                    </a:xfrm>
+                    <a:prstGeom prst="rect">
+                      <a:avLst/>
+                    </a:prstGeom>
+                    <a:ln>
+                      <a:noFill/>
+                    </a:ln>
+                    <a:extLst>
+                      <a:ext uri="{53640926-AAD7-44D8-BBD7-CCE9431645EC}">
+                        <a14:shadowObscured xmlns:a14="http://schemas.microsoft.com/office/drawing/2010/main"/>
+                      </a:ext>
+                    </a:extLst>
+                  </pic:spPr>
+                </pic:pic>
+              </a:graphicData>
+            </a:graphic>
+          </wp:inline>
+        </w:drawing>
+      </w:r>
+      <w:r>
+        <w:drawing>
+          <wp:inline distT="0" distB="0" distL="0" distR="0" wp14:anchorId="68C8D380" wp14:editId="733A9CCC">
+            <wp:extent cx="4318229" cy="1784804"/>
+            <wp:effectExtent l="0" t="0" r="6350" b="6350"/>
+            <wp:docPr id="7" name="圖片 7"/>
+            <wp:cNvGraphicFramePr>
+              <a:graphicFrameLocks xmlns:a="http://schemas.openxmlformats.org/drawingml/2006/main" noChangeAspect="1"/>
+            </wp:cNvGraphicFramePr>
+            <a:graphic xmlns:a="http://schemas.openxmlformats.org/drawingml/2006/main">
+              <a:graphicData uri="http://schemas.openxmlformats.org/drawingml/2006/picture">
+                <pic:pic xmlns:pic="http://schemas.openxmlformats.org/drawingml/2006/picture">
+                  <pic:nvPicPr>
+                    <pic:cNvPr id="1" name=""/>
+                    <pic:cNvPicPr/>
+                  </pic:nvPicPr>
+                  <pic:blipFill rotWithShape="1">
+                    <a:blip r:embed="rId10"/>
+                    <a:srcRect t="4538" b="12799"/>
+                    <a:stretch/>
+                  </pic:blipFill>
+                  <pic:spPr bwMode="auto">
+                    <a:xfrm>
+                      <a:off x="0" y="0"/>
+                      <a:ext cx="4320000" cy="1785536"/>
+                    </a:xfrm>
+                    <a:prstGeom prst="rect">
+                      <a:avLst/>
+                    </a:prstGeom>
+                    <a:ln>
+                      <a:noFill/>
+                    </a:ln>
+                    <a:extLst>
+                      <a:ext uri="{53640926-AAD7-44D8-BBD7-CCE9431645EC}">
+                        <a14:shadowObscured xmlns:a14="http://schemas.microsoft.com/office/drawing/2010/main"/>
+                      </a:ext>
+                    </a:extLst>
                   </pic:spPr>
                 </pic:pic>
               </a:graphicData>

</xml_diff>

<commit_message>
complete quiz 2 basic
</commit_message>
<xml_diff>
--- a/week1/AI.docx
+++ b/week1/AI.docx
@@ -32,6 +32,9 @@
         <w:jc w:val="center"/>
       </w:pPr>
       <w:r>
+        <w:rPr>
+          <w:noProof/>
+        </w:rPr>
         <w:drawing>
           <wp:inline distT="0" distB="0" distL="0" distR="0" wp14:anchorId="07BE3C63" wp14:editId="5CC4C417">
             <wp:extent cx="4320000" cy="2679359"/>
@@ -81,6 +84,9 @@
         <w:jc w:val="center"/>
       </w:pPr>
       <w:r>
+        <w:rPr>
+          <w:noProof/>
+        </w:rPr>
         <w:drawing>
           <wp:inline distT="0" distB="0" distL="0" distR="0" wp14:anchorId="61CC84C4" wp14:editId="4D2C93AD">
             <wp:extent cx="4320000" cy="2310831"/>
@@ -123,6 +129,9 @@
         <w:jc w:val="center"/>
       </w:pPr>
       <w:r>
+        <w:rPr>
+          <w:noProof/>
+        </w:rPr>
         <w:drawing>
           <wp:inline distT="0" distB="0" distL="0" distR="0" wp14:anchorId="5FE6733A" wp14:editId="1E4A52C0">
             <wp:extent cx="4320000" cy="2278137"/>
@@ -219,11 +228,11 @@
     <w:p>
       <w:pPr>
         <w:jc w:val="center"/>
-        <w:rPr>
-          <w:rFonts w:hint="eastAsia"/>
-        </w:rPr>
       </w:pPr>
       <w:r>
+        <w:rPr>
+          <w:noProof/>
+        </w:rPr>
         <w:drawing>
           <wp:inline distT="0" distB="0" distL="0" distR="0" wp14:anchorId="61F16090" wp14:editId="0FEE907E">
             <wp:extent cx="4318964" cy="2277201"/>
@@ -268,6 +277,9 @@
         </w:drawing>
       </w:r>
       <w:r>
+        <w:rPr>
+          <w:noProof/>
+        </w:rPr>
         <w:drawing>
           <wp:inline distT="0" distB="0" distL="0" distR="0" wp14:anchorId="5A79F052" wp14:editId="430793BF">
             <wp:extent cx="4318308" cy="1483360"/>
@@ -312,6 +324,9 @@
         </w:drawing>
       </w:r>
       <w:r>
+        <w:rPr>
+          <w:noProof/>
+        </w:rPr>
         <w:drawing>
           <wp:inline distT="0" distB="0" distL="0" distR="0" wp14:anchorId="00B9C927" wp14:editId="25ED9F17">
             <wp:extent cx="4319458" cy="2265680"/>
@@ -356,6 +371,9 @@
         </w:drawing>
       </w:r>
       <w:r>
+        <w:rPr>
+          <w:noProof/>
+        </w:rPr>
         <w:drawing>
           <wp:inline distT="0" distB="0" distL="0" distR="0" wp14:anchorId="68C8D380" wp14:editId="733A9CCC">
             <wp:extent cx="4318229" cy="1784804"/>
@@ -392,6 +410,129 @@
                         <a14:shadowObscured xmlns:a14="http://schemas.microsoft.com/office/drawing/2010/main"/>
                       </a:ext>
                     </a:extLst>
+                  </pic:spPr>
+                </pic:pic>
+              </a:graphicData>
+            </a:graphic>
+          </wp:inline>
+        </w:drawing>
+      </w:r>
+    </w:p>
+    <w:p>
+      <w:pPr>
+        <w:widowControl/>
+      </w:pPr>
+      <w:r>
+        <w:br w:type="page"/>
+      </w:r>
+    </w:p>
+    <w:p>
+      <w:pPr>
+        <w:jc w:val="center"/>
+        <w:rPr>
+          <w:b/>
+          <w:bCs/>
+        </w:rPr>
+      </w:pPr>
+      <w:r>
+        <w:rPr>
+          <w:rFonts w:hint="eastAsia"/>
+          <w:b/>
+          <w:bCs/>
+        </w:rPr>
+        <w:lastRenderedPageBreak/>
+        <w:t xml:space="preserve">QUIZ 2 </w:t>
+      </w:r>
+      <w:r>
+        <w:rPr>
+          <w:rFonts w:hint="eastAsia"/>
+          <w:b/>
+          <w:bCs/>
+        </w:rPr>
+        <w:t>基礎</w:t>
+      </w:r>
+    </w:p>
+    <w:p>
+      <w:pPr>
+        <w:jc w:val="center"/>
+        <w:rPr>
+          <w:rFonts w:hint="eastAsia"/>
+        </w:rPr>
+      </w:pPr>
+      <w:r>
+        <w:drawing>
+          <wp:inline distT="0" distB="0" distL="0" distR="0" wp14:anchorId="72F61A2B" wp14:editId="58D0B65F">
+            <wp:extent cx="4320000" cy="1673181"/>
+            <wp:effectExtent l="0" t="0" r="4445" b="3810"/>
+            <wp:docPr id="8" name="圖片 8"/>
+            <wp:cNvGraphicFramePr>
+              <a:graphicFrameLocks xmlns:a="http://schemas.openxmlformats.org/drawingml/2006/main" noChangeAspect="1"/>
+            </wp:cNvGraphicFramePr>
+            <a:graphic xmlns:a="http://schemas.openxmlformats.org/drawingml/2006/main">
+              <a:graphicData uri="http://schemas.openxmlformats.org/drawingml/2006/picture">
+                <pic:pic xmlns:pic="http://schemas.openxmlformats.org/drawingml/2006/picture">
+                  <pic:nvPicPr>
+                    <pic:cNvPr id="1" name=""/>
+                    <pic:cNvPicPr/>
+                  </pic:nvPicPr>
+                  <pic:blipFill rotWithShape="1">
+                    <a:blip r:embed="rId11"/>
+                    <a:srcRect t="5299"/>
+                    <a:stretch/>
+                  </pic:blipFill>
+                  <pic:spPr bwMode="auto">
+                    <a:xfrm>
+                      <a:off x="0" y="0"/>
+                      <a:ext cx="4320000" cy="1673181"/>
+                    </a:xfrm>
+                    <a:prstGeom prst="rect">
+                      <a:avLst/>
+                    </a:prstGeom>
+                    <a:ln>
+                      <a:noFill/>
+                    </a:ln>
+                    <a:extLst>
+                      <a:ext uri="{53640926-AAD7-44D8-BBD7-CCE9431645EC}">
+                        <a14:shadowObscured xmlns:a14="http://schemas.microsoft.com/office/drawing/2010/main"/>
+                      </a:ext>
+                    </a:extLst>
+                  </pic:spPr>
+                </pic:pic>
+              </a:graphicData>
+            </a:graphic>
+          </wp:inline>
+        </w:drawing>
+      </w:r>
+      <w:r>
+        <w:drawing>
+          <wp:inline distT="0" distB="0" distL="0" distR="0" wp14:anchorId="5CC726E8" wp14:editId="177415F9">
+            <wp:extent cx="4320000" cy="2808052"/>
+            <wp:effectExtent l="0" t="0" r="4445" b="0"/>
+            <wp:docPr id="9" name="圖片 9"/>
+            <wp:cNvGraphicFramePr>
+              <a:graphicFrameLocks xmlns:a="http://schemas.openxmlformats.org/drawingml/2006/main" noChangeAspect="1"/>
+            </wp:cNvGraphicFramePr>
+            <a:graphic xmlns:a="http://schemas.openxmlformats.org/drawingml/2006/main">
+              <a:graphicData uri="http://schemas.openxmlformats.org/drawingml/2006/picture">
+                <pic:pic xmlns:pic="http://schemas.openxmlformats.org/drawingml/2006/picture">
+                  <pic:nvPicPr>
+                    <pic:cNvPr id="1" name=""/>
+                    <pic:cNvPicPr/>
+                  </pic:nvPicPr>
+                  <pic:blipFill>
+                    <a:blip r:embed="rId12"/>
+                    <a:stretch>
+                      <a:fillRect/>
+                    </a:stretch>
+                  </pic:blipFill>
+                  <pic:spPr>
+                    <a:xfrm>
+                      <a:off x="0" y="0"/>
+                      <a:ext cx="4320000" cy="2808052"/>
+                    </a:xfrm>
+                    <a:prstGeom prst="rect">
+                      <a:avLst/>
+                    </a:prstGeom>
                   </pic:spPr>
                 </pic:pic>
               </a:graphicData>

</xml_diff>

<commit_message>
Restore completed Quiz 2 assignment
</commit_message>
<xml_diff>
--- a/week1/AI.docx
+++ b/week1/AI.docx
@@ -455,9 +455,6 @@
     <w:p>
       <w:pPr>
         <w:jc w:val="center"/>
-        <w:rPr>
-          <w:rFonts w:hint="eastAsia"/>
-        </w:rPr>
       </w:pPr>
       <w:r>
         <w:drawing>
@@ -539,6 +536,411 @@
             </a:graphic>
           </wp:inline>
         </w:drawing>
+      </w:r>
+    </w:p>
+    <w:p>
+      <w:pPr>
+        <w:jc w:val="center"/>
+        <w:rPr>
+          <w:b/>
+          <w:bCs/>
+        </w:rPr>
+      </w:pPr>
+      <w:r>
+        <w:rPr>
+          <w:rFonts w:hint="eastAsia"/>
+          <w:b/>
+          <w:bCs/>
+        </w:rPr>
+        <w:t>Q</w:t>
+      </w:r>
+      <w:r>
+        <w:rPr>
+          <w:b/>
+          <w:bCs/>
+        </w:rPr>
+        <w:t xml:space="preserve">UIZ 2 </w:t>
+      </w:r>
+      <w:r>
+        <w:rPr>
+          <w:rFonts w:hint="eastAsia"/>
+          <w:b/>
+          <w:bCs/>
+        </w:rPr>
+        <w:t>進階</w:t>
+      </w:r>
+    </w:p>
+    <w:p>
+      <w:pPr>
+        <w:jc w:val="center"/>
+        <w:rPr>
+          <w:b/>
+          <w:bCs/>
+        </w:rPr>
+      </w:pPr>
+      <w:r>
+        <w:rPr>
+          <w:b/>
+          <w:bCs/>
+        </w:rPr>
+        <w:drawing>
+          <wp:inline distT="0" distB="0" distL="0" distR="0" wp14:anchorId="3B571BF4" wp14:editId="3F8BD870">
+            <wp:extent cx="4320000" cy="2817340"/>
+            <wp:effectExtent l="0" t="0" r="4445" b="2540"/>
+            <wp:docPr id="10" name="圖片 10"/>
+            <wp:cNvGraphicFramePr>
+              <a:graphicFrameLocks xmlns:a="http://schemas.openxmlformats.org/drawingml/2006/main" noChangeAspect="1"/>
+            </wp:cNvGraphicFramePr>
+            <a:graphic xmlns:a="http://schemas.openxmlformats.org/drawingml/2006/main">
+              <a:graphicData uri="http://schemas.openxmlformats.org/drawingml/2006/picture">
+                <pic:pic xmlns:pic="http://schemas.openxmlformats.org/drawingml/2006/picture">
+                  <pic:nvPicPr>
+                    <pic:cNvPr id="1" name=""/>
+                    <pic:cNvPicPr/>
+                  </pic:nvPicPr>
+                  <pic:blipFill rotWithShape="1">
+                    <a:blip r:embed="rId13"/>
+                    <a:srcRect t="1404"/>
+                    <a:stretch/>
+                  </pic:blipFill>
+                  <pic:spPr bwMode="auto">
+                    <a:xfrm>
+                      <a:off x="0" y="0"/>
+                      <a:ext cx="4320000" cy="2817340"/>
+                    </a:xfrm>
+                    <a:prstGeom prst="rect">
+                      <a:avLst/>
+                    </a:prstGeom>
+                    <a:ln>
+                      <a:noFill/>
+                    </a:ln>
+                    <a:extLst>
+                      <a:ext uri="{53640926-AAD7-44D8-BBD7-CCE9431645EC}">
+                        <a14:shadowObscured xmlns:a14="http://schemas.microsoft.com/office/drawing/2010/main"/>
+                      </a:ext>
+                    </a:extLst>
+                  </pic:spPr>
+                </pic:pic>
+              </a:graphicData>
+            </a:graphic>
+          </wp:inline>
+        </w:drawing>
+      </w:r>
+      <w:r>
+        <w:rPr>
+          <w:b/>
+          <w:bCs/>
+        </w:rPr>
+        <w:lastRenderedPageBreak/>
+        <w:drawing>
+          <wp:inline distT="0" distB="0" distL="0" distR="0" wp14:anchorId="3963DA96" wp14:editId="49058A43">
+            <wp:extent cx="4320000" cy="925046"/>
+            <wp:effectExtent l="0" t="0" r="4445" b="8890"/>
+            <wp:docPr id="11" name="圖片 11"/>
+            <wp:cNvGraphicFramePr>
+              <a:graphicFrameLocks xmlns:a="http://schemas.openxmlformats.org/drawingml/2006/main" noChangeAspect="1"/>
+            </wp:cNvGraphicFramePr>
+            <a:graphic xmlns:a="http://schemas.openxmlformats.org/drawingml/2006/main">
+              <a:graphicData uri="http://schemas.openxmlformats.org/drawingml/2006/picture">
+                <pic:pic xmlns:pic="http://schemas.openxmlformats.org/drawingml/2006/picture">
+                  <pic:nvPicPr>
+                    <pic:cNvPr id="1" name=""/>
+                    <pic:cNvPicPr/>
+                  </pic:nvPicPr>
+                  <pic:blipFill rotWithShape="1">
+                    <a:blip r:embed="rId14"/>
+                    <a:srcRect t="5895"/>
+                    <a:stretch/>
+                  </pic:blipFill>
+                  <pic:spPr bwMode="auto">
+                    <a:xfrm>
+                      <a:off x="0" y="0"/>
+                      <a:ext cx="4320000" cy="925046"/>
+                    </a:xfrm>
+                    <a:prstGeom prst="rect">
+                      <a:avLst/>
+                    </a:prstGeom>
+                    <a:ln>
+                      <a:noFill/>
+                    </a:ln>
+                    <a:extLst>
+                      <a:ext uri="{53640926-AAD7-44D8-BBD7-CCE9431645EC}">
+                        <a14:shadowObscured xmlns:a14="http://schemas.microsoft.com/office/drawing/2010/main"/>
+                      </a:ext>
+                    </a:extLst>
+                  </pic:spPr>
+                </pic:pic>
+              </a:graphicData>
+            </a:graphic>
+          </wp:inline>
+        </w:drawing>
+      </w:r>
+      <w:r>
+        <w:rPr>
+          <w:b/>
+          <w:bCs/>
+        </w:rPr>
+        <w:drawing>
+          <wp:inline distT="0" distB="0" distL="0" distR="0" wp14:anchorId="2EB31E6A" wp14:editId="5B41826B">
+            <wp:extent cx="4320000" cy="2366779"/>
+            <wp:effectExtent l="0" t="0" r="4445" b="0"/>
+            <wp:docPr id="12" name="圖片 12"/>
+            <wp:cNvGraphicFramePr>
+              <a:graphicFrameLocks xmlns:a="http://schemas.openxmlformats.org/drawingml/2006/main" noChangeAspect="1"/>
+            </wp:cNvGraphicFramePr>
+            <a:graphic xmlns:a="http://schemas.openxmlformats.org/drawingml/2006/main">
+              <a:graphicData uri="http://schemas.openxmlformats.org/drawingml/2006/picture">
+                <pic:pic xmlns:pic="http://schemas.openxmlformats.org/drawingml/2006/picture">
+                  <pic:nvPicPr>
+                    <pic:cNvPr id="1" name=""/>
+                    <pic:cNvPicPr/>
+                  </pic:nvPicPr>
+                  <pic:blipFill rotWithShape="1">
+                    <a:blip r:embed="rId15"/>
+                    <a:srcRect t="2390"/>
+                    <a:stretch/>
+                  </pic:blipFill>
+                  <pic:spPr bwMode="auto">
+                    <a:xfrm>
+                      <a:off x="0" y="0"/>
+                      <a:ext cx="4320000" cy="2366779"/>
+                    </a:xfrm>
+                    <a:prstGeom prst="rect">
+                      <a:avLst/>
+                    </a:prstGeom>
+                    <a:ln>
+                      <a:noFill/>
+                    </a:ln>
+                    <a:extLst>
+                      <a:ext uri="{53640926-AAD7-44D8-BBD7-CCE9431645EC}">
+                        <a14:shadowObscured xmlns:a14="http://schemas.microsoft.com/office/drawing/2010/main"/>
+                      </a:ext>
+                    </a:extLst>
+                  </pic:spPr>
+                </pic:pic>
+              </a:graphicData>
+            </a:graphic>
+          </wp:inline>
+        </w:drawing>
+      </w:r>
+      <w:r>
+        <w:rPr>
+          <w:b/>
+          <w:bCs/>
+        </w:rPr>
+        <w:drawing>
+          <wp:inline distT="0" distB="0" distL="0" distR="0" wp14:anchorId="05CF989E" wp14:editId="5A8A64FF">
+            <wp:extent cx="4319770" cy="1968954"/>
+            <wp:effectExtent l="0" t="0" r="5080" b="0"/>
+            <wp:docPr id="13" name="圖片 13"/>
+            <wp:cNvGraphicFramePr>
+              <a:graphicFrameLocks xmlns:a="http://schemas.openxmlformats.org/drawingml/2006/main" noChangeAspect="1"/>
+            </wp:cNvGraphicFramePr>
+            <a:graphic xmlns:a="http://schemas.openxmlformats.org/drawingml/2006/main">
+              <a:graphicData uri="http://schemas.openxmlformats.org/drawingml/2006/picture">
+                <pic:pic xmlns:pic="http://schemas.openxmlformats.org/drawingml/2006/picture">
+                  <pic:nvPicPr>
+                    <pic:cNvPr id="1" name=""/>
+                    <pic:cNvPicPr/>
+                  </pic:nvPicPr>
+                  <pic:blipFill rotWithShape="1">
+                    <a:blip r:embed="rId16"/>
+                    <a:srcRect t="2951"/>
+                    <a:stretch/>
+                  </pic:blipFill>
+                  <pic:spPr bwMode="auto">
+                    <a:xfrm>
+                      <a:off x="0" y="0"/>
+                      <a:ext cx="4320000" cy="1969059"/>
+                    </a:xfrm>
+                    <a:prstGeom prst="rect">
+                      <a:avLst/>
+                    </a:prstGeom>
+                    <a:ln>
+                      <a:noFill/>
+                    </a:ln>
+                    <a:extLst>
+                      <a:ext uri="{53640926-AAD7-44D8-BBD7-CCE9431645EC}">
+                        <a14:shadowObscured xmlns:a14="http://schemas.microsoft.com/office/drawing/2010/main"/>
+                      </a:ext>
+                    </a:extLst>
+                  </pic:spPr>
+                </pic:pic>
+              </a:graphicData>
+            </a:graphic>
+          </wp:inline>
+        </w:drawing>
+      </w:r>
+      <w:r>
+        <w:rPr>
+          <w:b/>
+          <w:bCs/>
+        </w:rPr>
+        <w:drawing>
+          <wp:inline distT="0" distB="0" distL="0" distR="0" wp14:anchorId="4478BBDB" wp14:editId="5D6F08C8">
+            <wp:extent cx="4320000" cy="2786641"/>
+            <wp:effectExtent l="0" t="0" r="4445" b="0"/>
+            <wp:docPr id="14" name="圖片 14"/>
+            <wp:cNvGraphicFramePr>
+              <a:graphicFrameLocks xmlns:a="http://schemas.openxmlformats.org/drawingml/2006/main" noChangeAspect="1"/>
+            </wp:cNvGraphicFramePr>
+            <a:graphic xmlns:a="http://schemas.openxmlformats.org/drawingml/2006/main">
+              <a:graphicData uri="http://schemas.openxmlformats.org/drawingml/2006/picture">
+                <pic:pic xmlns:pic="http://schemas.openxmlformats.org/drawingml/2006/picture">
+                  <pic:nvPicPr>
+                    <pic:cNvPr id="1" name=""/>
+                    <pic:cNvPicPr/>
+                  </pic:nvPicPr>
+                  <pic:blipFill rotWithShape="1">
+                    <a:blip r:embed="rId17"/>
+                    <a:srcRect t="1669" b="3451"/>
+                    <a:stretch/>
+                  </pic:blipFill>
+                  <pic:spPr bwMode="auto">
+                    <a:xfrm>
+                      <a:off x="0" y="0"/>
+                      <a:ext cx="4320000" cy="2786641"/>
+                    </a:xfrm>
+                    <a:prstGeom prst="rect">
+                      <a:avLst/>
+                    </a:prstGeom>
+                    <a:ln>
+                      <a:noFill/>
+                    </a:ln>
+                    <a:extLst>
+                      <a:ext uri="{53640926-AAD7-44D8-BBD7-CCE9431645EC}">
+                        <a14:shadowObscured xmlns:a14="http://schemas.microsoft.com/office/drawing/2010/main"/>
+                      </a:ext>
+                    </a:extLst>
+                  </pic:spPr>
+                </pic:pic>
+              </a:graphicData>
+            </a:graphic>
+          </wp:inline>
+        </w:drawing>
+      </w:r>
+      <w:r>
+        <w:rPr>
+          <w:b/>
+          <w:bCs/>
+        </w:rPr>
+        <w:lastRenderedPageBreak/>
+        <w:drawing>
+          <wp:inline distT="0" distB="0" distL="0" distR="0" wp14:anchorId="30C126AE" wp14:editId="77E3D444">
+            <wp:extent cx="4320000" cy="2323313"/>
+            <wp:effectExtent l="0" t="0" r="4445" b="1270"/>
+            <wp:docPr id="15" name="圖片 15"/>
+            <wp:cNvGraphicFramePr>
+              <a:graphicFrameLocks xmlns:a="http://schemas.openxmlformats.org/drawingml/2006/main" noChangeAspect="1"/>
+            </wp:cNvGraphicFramePr>
+            <a:graphic xmlns:a="http://schemas.openxmlformats.org/drawingml/2006/main">
+              <a:graphicData uri="http://schemas.openxmlformats.org/drawingml/2006/picture">
+                <pic:pic xmlns:pic="http://schemas.openxmlformats.org/drawingml/2006/picture">
+                  <pic:nvPicPr>
+                    <pic:cNvPr id="1" name=""/>
+                    <pic:cNvPicPr/>
+                  </pic:nvPicPr>
+                  <pic:blipFill>
+                    <a:blip r:embed="rId18"/>
+                    <a:stretch>
+                      <a:fillRect/>
+                    </a:stretch>
+                  </pic:blipFill>
+                  <pic:spPr>
+                    <a:xfrm>
+                      <a:off x="0" y="0"/>
+                      <a:ext cx="4320000" cy="2323313"/>
+                    </a:xfrm>
+                    <a:prstGeom prst="rect">
+                      <a:avLst/>
+                    </a:prstGeom>
+                  </pic:spPr>
+                </pic:pic>
+              </a:graphicData>
+            </a:graphic>
+          </wp:inline>
+        </w:drawing>
+      </w:r>
+      <w:r>
+        <w:rPr>
+          <w:b/>
+          <w:bCs/>
+        </w:rPr>
+        <w:drawing>
+          <wp:inline distT="0" distB="0" distL="0" distR="0" wp14:anchorId="25EC0876" wp14:editId="52D55DAA">
+            <wp:extent cx="4320000" cy="2671933"/>
+            <wp:effectExtent l="0" t="0" r="4445" b="0"/>
+            <wp:docPr id="16" name="圖片 16"/>
+            <wp:cNvGraphicFramePr>
+              <a:graphicFrameLocks xmlns:a="http://schemas.openxmlformats.org/drawingml/2006/main" noChangeAspect="1"/>
+            </wp:cNvGraphicFramePr>
+            <a:graphic xmlns:a="http://schemas.openxmlformats.org/drawingml/2006/main">
+              <a:graphicData uri="http://schemas.openxmlformats.org/drawingml/2006/picture">
+                <pic:pic xmlns:pic="http://schemas.openxmlformats.org/drawingml/2006/picture">
+                  <pic:nvPicPr>
+                    <pic:cNvPr id="1" name=""/>
+                    <pic:cNvPicPr/>
+                  </pic:nvPicPr>
+                  <pic:blipFill rotWithShape="1">
+                    <a:blip r:embed="rId19"/>
+                    <a:srcRect t="1641"/>
+                    <a:stretch/>
+                  </pic:blipFill>
+                  <pic:spPr bwMode="auto">
+                    <a:xfrm>
+                      <a:off x="0" y="0"/>
+                      <a:ext cx="4320000" cy="2671933"/>
+                    </a:xfrm>
+                    <a:prstGeom prst="rect">
+                      <a:avLst/>
+                    </a:prstGeom>
+                    <a:ln>
+                      <a:noFill/>
+                    </a:ln>
+                    <a:extLst>
+                      <a:ext uri="{53640926-AAD7-44D8-BBD7-CCE9431645EC}">
+                        <a14:shadowObscured xmlns:a14="http://schemas.microsoft.com/office/drawing/2010/main"/>
+                      </a:ext>
+                    </a:extLst>
+                  </pic:spPr>
+                </pic:pic>
+              </a:graphicData>
+            </a:graphic>
+          </wp:inline>
+        </w:drawing>
+      </w:r>
+    </w:p>
+    <w:p>
+      <w:pPr>
+        <w:jc w:val="center"/>
+        <w:rPr>
+          <w:rFonts w:hint="eastAsia"/>
+          <w:b/>
+          <w:bCs/>
+        </w:rPr>
+      </w:pPr>
+      <w:r>
+        <w:rPr>
+          <w:rFonts w:hint="eastAsia"/>
+          <w:b/>
+          <w:bCs/>
+        </w:rPr>
+        <w:t>Q</w:t>
+      </w:r>
+      <w:r>
+        <w:rPr>
+          <w:b/>
+          <w:bCs/>
+        </w:rPr>
+        <w:t xml:space="preserve">UIZ 3 </w:t>
+      </w:r>
+      <w:r>
+        <w:rPr>
+          <w:rFonts w:hint="eastAsia"/>
+          <w:b/>
+          <w:bCs/>
+        </w:rPr>
+        <w:t>基礎</w:t>
       </w:r>
     </w:p>
     <w:sectPr>

</xml_diff>

<commit_message>
complete quiz 3 basic
</commit_message>
<xml_diff>
--- a/week1/AI.docx
+++ b/week1/AI.docx
@@ -457,6 +457,9 @@
         <w:jc w:val="center"/>
       </w:pPr>
       <w:r>
+        <w:rPr>
+          <w:noProof/>
+        </w:rPr>
         <w:drawing>
           <wp:inline distT="0" distB="0" distL="0" distR="0" wp14:anchorId="72F61A2B" wp14:editId="58D0B65F">
             <wp:extent cx="4320000" cy="1673181"/>
@@ -501,6 +504,9 @@
         </w:drawing>
       </w:r>
       <w:r>
+        <w:rPr>
+          <w:noProof/>
+        </w:rPr>
         <w:drawing>
           <wp:inline distT="0" distB="0" distL="0" distR="0" wp14:anchorId="5CC726E8" wp14:editId="177415F9">
             <wp:extent cx="4320000" cy="2808052"/>
@@ -582,6 +588,7 @@
         <w:rPr>
           <w:b/>
           <w:bCs/>
+          <w:noProof/>
         </w:rPr>
         <w:drawing>
           <wp:inline distT="0" distB="0" distL="0" distR="0" wp14:anchorId="3B571BF4" wp14:editId="3F8BD870">
@@ -630,6 +637,7 @@
         <w:rPr>
           <w:b/>
           <w:bCs/>
+          <w:noProof/>
         </w:rPr>
         <w:lastRenderedPageBreak/>
         <w:drawing>
@@ -679,6 +687,7 @@
         <w:rPr>
           <w:b/>
           <w:bCs/>
+          <w:noProof/>
         </w:rPr>
         <w:drawing>
           <wp:inline distT="0" distB="0" distL="0" distR="0" wp14:anchorId="2EB31E6A" wp14:editId="5B41826B">
@@ -727,6 +736,7 @@
         <w:rPr>
           <w:b/>
           <w:bCs/>
+          <w:noProof/>
         </w:rPr>
         <w:drawing>
           <wp:inline distT="0" distB="0" distL="0" distR="0" wp14:anchorId="05CF989E" wp14:editId="5A8A64FF">
@@ -775,6 +785,7 @@
         <w:rPr>
           <w:b/>
           <w:bCs/>
+          <w:noProof/>
         </w:rPr>
         <w:drawing>
           <wp:inline distT="0" distB="0" distL="0" distR="0" wp14:anchorId="4478BBDB" wp14:editId="5D6F08C8">
@@ -823,6 +834,7 @@
         <w:rPr>
           <w:b/>
           <w:bCs/>
+          <w:noProof/>
         </w:rPr>
         <w:lastRenderedPageBreak/>
         <w:drawing>
@@ -865,6 +877,7 @@
         <w:rPr>
           <w:b/>
           <w:bCs/>
+          <w:noProof/>
         </w:rPr>
         <w:drawing>
           <wp:inline distT="0" distB="0" distL="0" distR="0" wp14:anchorId="25EC0876" wp14:editId="52D55DAA">
@@ -914,17 +927,313 @@
       <w:pPr>
         <w:jc w:val="center"/>
         <w:rPr>
+          <w:b/>
+          <w:bCs/>
+        </w:rPr>
+      </w:pPr>
+      <w:r>
+        <w:rPr>
           <w:rFonts w:hint="eastAsia"/>
           <w:b/>
           <w:bCs/>
         </w:rPr>
+        <w:t>Q</w:t>
+      </w:r>
+      <w:r>
+        <w:rPr>
+          <w:b/>
+          <w:bCs/>
+        </w:rPr>
+        <w:t xml:space="preserve">UIZ 3 </w:t>
+      </w:r>
+      <w:r>
+        <w:rPr>
+          <w:rFonts w:hint="eastAsia"/>
+          <w:b/>
+          <w:bCs/>
+        </w:rPr>
+        <w:t>基礎</w:t>
+      </w:r>
+    </w:p>
+    <w:p>
+      <w:pPr>
+        <w:jc w:val="center"/>
+        <w:rPr>
+          <w:b/>
+          <w:bCs/>
+        </w:rPr>
       </w:pPr>
       <w:r>
         <w:rPr>
+          <w:b/>
+          <w:bCs/>
+        </w:rPr>
+        <w:drawing>
+          <wp:inline distT="0" distB="0" distL="0" distR="0" wp14:anchorId="161E030A" wp14:editId="6052CB27">
+            <wp:extent cx="4320000" cy="2710272"/>
+            <wp:effectExtent l="0" t="0" r="4445" b="0"/>
+            <wp:docPr id="17" name="圖片 17"/>
+            <wp:cNvGraphicFramePr>
+              <a:graphicFrameLocks xmlns:a="http://schemas.openxmlformats.org/drawingml/2006/main" noChangeAspect="1"/>
+            </wp:cNvGraphicFramePr>
+            <a:graphic xmlns:a="http://schemas.openxmlformats.org/drawingml/2006/main">
+              <a:graphicData uri="http://schemas.openxmlformats.org/drawingml/2006/picture">
+                <pic:pic xmlns:pic="http://schemas.openxmlformats.org/drawingml/2006/picture">
+                  <pic:nvPicPr>
+                    <pic:cNvPr id="1" name=""/>
+                    <pic:cNvPicPr/>
+                  </pic:nvPicPr>
+                  <pic:blipFill>
+                    <a:blip r:embed="rId20"/>
+                    <a:stretch>
+                      <a:fillRect/>
+                    </a:stretch>
+                  </pic:blipFill>
+                  <pic:spPr>
+                    <a:xfrm>
+                      <a:off x="0" y="0"/>
+                      <a:ext cx="4320000" cy="2710272"/>
+                    </a:xfrm>
+                    <a:prstGeom prst="rect">
+                      <a:avLst/>
+                    </a:prstGeom>
+                  </pic:spPr>
+                </pic:pic>
+              </a:graphicData>
+            </a:graphic>
+          </wp:inline>
+        </w:drawing>
+      </w:r>
+      <w:r>
+        <w:rPr>
+          <w:b/>
+          <w:bCs/>
+        </w:rPr>
+        <w:lastRenderedPageBreak/>
+        <w:drawing>
+          <wp:inline distT="0" distB="0" distL="0" distR="0" wp14:anchorId="5B919937" wp14:editId="60DA61C5">
+            <wp:extent cx="4320000" cy="3240780"/>
+            <wp:effectExtent l="0" t="0" r="4445" b="0"/>
+            <wp:docPr id="18" name="圖片 18"/>
+            <wp:cNvGraphicFramePr>
+              <a:graphicFrameLocks xmlns:a="http://schemas.openxmlformats.org/drawingml/2006/main" noChangeAspect="1"/>
+            </wp:cNvGraphicFramePr>
+            <a:graphic xmlns:a="http://schemas.openxmlformats.org/drawingml/2006/main">
+              <a:graphicData uri="http://schemas.openxmlformats.org/drawingml/2006/picture">
+                <pic:pic xmlns:pic="http://schemas.openxmlformats.org/drawingml/2006/picture">
+                  <pic:nvPicPr>
+                    <pic:cNvPr id="1" name=""/>
+                    <pic:cNvPicPr/>
+                  </pic:nvPicPr>
+                  <pic:blipFill>
+                    <a:blip r:embed="rId21"/>
+                    <a:stretch>
+                      <a:fillRect/>
+                    </a:stretch>
+                  </pic:blipFill>
+                  <pic:spPr>
+                    <a:xfrm>
+                      <a:off x="0" y="0"/>
+                      <a:ext cx="4320000" cy="3240780"/>
+                    </a:xfrm>
+                    <a:prstGeom prst="rect">
+                      <a:avLst/>
+                    </a:prstGeom>
+                  </pic:spPr>
+                </pic:pic>
+              </a:graphicData>
+            </a:graphic>
+          </wp:inline>
+        </w:drawing>
+      </w:r>
+      <w:r>
+        <w:rPr>
+          <w:b/>
+          <w:bCs/>
+        </w:rPr>
+        <w:drawing>
+          <wp:inline distT="0" distB="0" distL="0" distR="0" wp14:anchorId="1238D79A" wp14:editId="62B2F1B6">
+            <wp:extent cx="4320000" cy="1983164"/>
+            <wp:effectExtent l="0" t="0" r="4445" b="0"/>
+            <wp:docPr id="19" name="圖片 19"/>
+            <wp:cNvGraphicFramePr>
+              <a:graphicFrameLocks xmlns:a="http://schemas.openxmlformats.org/drawingml/2006/main" noChangeAspect="1"/>
+            </wp:cNvGraphicFramePr>
+            <a:graphic xmlns:a="http://schemas.openxmlformats.org/drawingml/2006/main">
+              <a:graphicData uri="http://schemas.openxmlformats.org/drawingml/2006/picture">
+                <pic:pic xmlns:pic="http://schemas.openxmlformats.org/drawingml/2006/picture">
+                  <pic:nvPicPr>
+                    <pic:cNvPr id="1" name=""/>
+                    <pic:cNvPicPr/>
+                  </pic:nvPicPr>
+                  <pic:blipFill rotWithShape="1">
+                    <a:blip r:embed="rId22"/>
+                    <a:srcRect t="7294"/>
+                    <a:stretch/>
+                  </pic:blipFill>
+                  <pic:spPr bwMode="auto">
+                    <a:xfrm>
+                      <a:off x="0" y="0"/>
+                      <a:ext cx="4320000" cy="1983164"/>
+                    </a:xfrm>
+                    <a:prstGeom prst="rect">
+                      <a:avLst/>
+                    </a:prstGeom>
+                    <a:ln>
+                      <a:noFill/>
+                    </a:ln>
+                    <a:extLst>
+                      <a:ext uri="{53640926-AAD7-44D8-BBD7-CCE9431645EC}">
+                        <a14:shadowObscured xmlns:a14="http://schemas.microsoft.com/office/drawing/2010/main"/>
+                      </a:ext>
+                    </a:extLst>
+                  </pic:spPr>
+                </pic:pic>
+              </a:graphicData>
+            </a:graphic>
+          </wp:inline>
+        </w:drawing>
+      </w:r>
+      <w:r>
+        <w:rPr>
+          <w:b/>
+          <w:bCs/>
+        </w:rPr>
+        <w:drawing>
+          <wp:inline distT="0" distB="0" distL="0" distR="0" wp14:anchorId="274C1C8C" wp14:editId="41D81E2D">
+            <wp:extent cx="4320000" cy="2575045"/>
+            <wp:effectExtent l="0" t="0" r="4445" b="0"/>
+            <wp:docPr id="20" name="圖片 20"/>
+            <wp:cNvGraphicFramePr>
+              <a:graphicFrameLocks xmlns:a="http://schemas.openxmlformats.org/drawingml/2006/main" noChangeAspect="1"/>
+            </wp:cNvGraphicFramePr>
+            <a:graphic xmlns:a="http://schemas.openxmlformats.org/drawingml/2006/main">
+              <a:graphicData uri="http://schemas.openxmlformats.org/drawingml/2006/picture">
+                <pic:pic xmlns:pic="http://schemas.openxmlformats.org/drawingml/2006/picture">
+                  <pic:nvPicPr>
+                    <pic:cNvPr id="1" name=""/>
+                    <pic:cNvPicPr/>
+                  </pic:nvPicPr>
+                  <pic:blipFill>
+                    <a:blip r:embed="rId23"/>
+                    <a:stretch>
+                      <a:fillRect/>
+                    </a:stretch>
+                  </pic:blipFill>
+                  <pic:spPr>
+                    <a:xfrm>
+                      <a:off x="0" y="0"/>
+                      <a:ext cx="4320000" cy="2575045"/>
+                    </a:xfrm>
+                    <a:prstGeom prst="rect">
+                      <a:avLst/>
+                    </a:prstGeom>
+                  </pic:spPr>
+                </pic:pic>
+              </a:graphicData>
+            </a:graphic>
+          </wp:inline>
+        </w:drawing>
+      </w:r>
+      <w:r>
+        <w:rPr>
+          <w:b/>
+          <w:bCs/>
+        </w:rPr>
+        <w:lastRenderedPageBreak/>
+        <w:drawing>
+          <wp:inline distT="0" distB="0" distL="0" distR="0" wp14:anchorId="701E5AE0" wp14:editId="2BF4A306">
+            <wp:extent cx="4320000" cy="2553200"/>
+            <wp:effectExtent l="0" t="0" r="4445" b="0"/>
+            <wp:docPr id="21" name="圖片 21"/>
+            <wp:cNvGraphicFramePr>
+              <a:graphicFrameLocks xmlns:a="http://schemas.openxmlformats.org/drawingml/2006/main" noChangeAspect="1"/>
+            </wp:cNvGraphicFramePr>
+            <a:graphic xmlns:a="http://schemas.openxmlformats.org/drawingml/2006/main">
+              <a:graphicData uri="http://schemas.openxmlformats.org/drawingml/2006/picture">
+                <pic:pic xmlns:pic="http://schemas.openxmlformats.org/drawingml/2006/picture">
+                  <pic:nvPicPr>
+                    <pic:cNvPr id="1" name=""/>
+                    <pic:cNvPicPr/>
+                  </pic:nvPicPr>
+                  <pic:blipFill>
+                    <a:blip r:embed="rId24"/>
+                    <a:stretch>
+                      <a:fillRect/>
+                    </a:stretch>
+                  </pic:blipFill>
+                  <pic:spPr>
+                    <a:xfrm>
+                      <a:off x="0" y="0"/>
+                      <a:ext cx="4320000" cy="2553200"/>
+                    </a:xfrm>
+                    <a:prstGeom prst="rect">
+                      <a:avLst/>
+                    </a:prstGeom>
+                  </pic:spPr>
+                </pic:pic>
+              </a:graphicData>
+            </a:graphic>
+          </wp:inline>
+        </w:drawing>
+      </w:r>
+      <w:r>
+        <w:rPr>
+          <w:b/>
+          <w:bCs/>
+        </w:rPr>
+        <w:drawing>
+          <wp:inline distT="0" distB="0" distL="0" distR="0" wp14:anchorId="50808BB1" wp14:editId="377BBCF9">
+            <wp:extent cx="4320000" cy="2414852"/>
+            <wp:effectExtent l="0" t="0" r="4445" b="5080"/>
+            <wp:docPr id="22" name="圖片 22"/>
+            <wp:cNvGraphicFramePr>
+              <a:graphicFrameLocks xmlns:a="http://schemas.openxmlformats.org/drawingml/2006/main" noChangeAspect="1"/>
+            </wp:cNvGraphicFramePr>
+            <a:graphic xmlns:a="http://schemas.openxmlformats.org/drawingml/2006/main">
+              <a:graphicData uri="http://schemas.openxmlformats.org/drawingml/2006/picture">
+                <pic:pic xmlns:pic="http://schemas.openxmlformats.org/drawingml/2006/picture">
+                  <pic:nvPicPr>
+                    <pic:cNvPr id="1" name=""/>
+                    <pic:cNvPicPr/>
+                  </pic:nvPicPr>
+                  <pic:blipFill>
+                    <a:blip r:embed="rId25"/>
+                    <a:stretch>
+                      <a:fillRect/>
+                    </a:stretch>
+                  </pic:blipFill>
+                  <pic:spPr>
+                    <a:xfrm>
+                      <a:off x="0" y="0"/>
+                      <a:ext cx="4320000" cy="2414852"/>
+                    </a:xfrm>
+                    <a:prstGeom prst="rect">
+                      <a:avLst/>
+                    </a:prstGeom>
+                  </pic:spPr>
+                </pic:pic>
+              </a:graphicData>
+            </a:graphic>
+          </wp:inline>
+        </w:drawing>
+      </w:r>
+    </w:p>
+    <w:p>
+      <w:pPr>
+        <w:jc w:val="center"/>
+        <w:rPr>
           <w:rFonts w:hint="eastAsia"/>
           <w:b/>
           <w:bCs/>
         </w:rPr>
+      </w:pPr>
+      <w:r>
+        <w:rPr>
+          <w:rFonts w:hint="eastAsia"/>
+          <w:b/>
+          <w:bCs/>
+        </w:rPr>
         <w:t>Q</w:t>
       </w:r>
       <w:r>
@@ -940,7 +1249,7 @@
           <w:b/>
           <w:bCs/>
         </w:rPr>
-        <w:t>基礎</w:t>
+        <w:t>進階</w:t>
       </w:r>
     </w:p>
     <w:sectPr>

</xml_diff>